<commit_message>
Deploy website - 2026-07-15 08:50:30
</commit_message>
<xml_diff>
--- a/assets/scandora-avv-dpa-template.docx
+++ b/assets/scandora-avv-dpa-template.docx
@@ -19,7 +19,29 @@
         <w:rPr>
           <w:i/>
         </w:rPr>
-        <w:t>Scandora — Managed AI Pass · Art. 28 DSGVO / GDPR</w:t>
+        <w:t>Scandora — Managed AI · Art. 28 DSGVO / GDPR</w:t>
+      </w:r>
+    </w:p>
+    <w:p>
+      <w:pPr>
+        <w:jc w:val="center"/>
+      </w:pPr>
+      <w:r>
+        <w:rPr>
+          <w:b/>
+        </w:rPr>
+        <w:t xml:space="preserve">Entwurf — externe anwaltliche Prüfung ausstehend. / Draft — external counsel review pending.</w:t>
+      </w:r>
+    </w:p>
+    <w:p>
+      <w:pPr>
+        <w:jc w:val="center"/>
+      </w:pPr>
+      <w:r>
+        <w:rPr>
+          <w:i/>
+        </w:rPr>
+        <w:t xml:space="preserve">Dieser AVV ist ein interner Entwurf, intern gegen die tatsächlichen Datenflüsse von Scandora geprüft. Er wurde noch nicht von externen Rechtsanwälten geprüft und kann sich ändern, bevor er zum Abschluss einer verbindlichen Vereinbarung verwendet wird. / This DPA is an internal draft, reviewed in-house against Scandora's actual data flows. It has not yet been reviewed by external legal counsel and may change before it is used to conclude a binding agreement.</w:t>
       </w:r>
     </w:p>
     <w:p>
@@ -104,12 +126,12 @@
     </w:p>
     <w:p>
       <w:r>
-        <w:t>Dieser Vertrag konkretisiert die datenschutzrechtlichen Pflichten der Parteien für die Verarbeitung personenbezogener Daten, die Scandora als Auftragsverarbeiter auf dem verwalteten „AI Pass“-Pfad im Auftrag des Verantwortlichen durchführt. Er gilt ergänzend zu den Nutzungsbedingungen und der Datenschutzerklärung von Scandora.</w:t>
+        <w:t>Dieser Vertrag konkretisiert die datenschutzrechtlichen Pflichten der Parteien für die Verarbeitung personenbezogener Daten, die Scandora als Auftragsverarbeiter auf dem Managed-AI-Pfad im Auftrag des Verantwortlichen durchführt. Er gilt ergänzend zu den Nutzungsbedingungen und der Datenschutzerklärung von Scandora.</w:t>
       </w:r>
     </w:p>
     <w:p>
       <w:r>
-        <w:t>Hinweis: Dieser verwaltete „AI Pass“-Pfad ist noch nicht aktiv. Im BYOAI-Modus (eigener API-Schlüssel) ist der Kunde selbst Verantwortlicher; dieser AVV gilt dann nicht.</w:t>
+        <w:t>Hinweis: Dieser Managed-AI-Pfad ist noch nicht aktiv. Im BYOAI-Modus (eigener API-Schlüssel) ist der Kunde selbst Verantwortlicher; dieser AVV gilt dann nicht.</w:t>
       </w:r>
     </w:p>
     <w:p>
@@ -122,7 +144,7 @@
     </w:p>
     <w:p>
       <w:r>
-        <w:t>Gegenstand ist die Verarbeitung von Dokumentinhalten zur KI-gestützten Analyse über das verwaltete AI Pass. Die Verarbeitung erfolgt für die Dauer der Nutzung des AI Pass und endet mit Beendigung des zugrunde liegenden Vertrags.</w:t>
+        <w:t>Gegenstand ist die Verarbeitung von Dokumentinhalten zur KI-gestützten Analyse über die verwaltete KI (Managed AI). Die Verarbeitung erfolgt für die Dauer der Nutzung der verwalteten KI und endet mit Beendigung des zugrunde liegenden Vertrags.</w:t>
       </w:r>
     </w:p>
     <w:p>
@@ -310,7 +332,7 @@
           </w:tcPr>
           <w:p>
             <w:r>
-              <w:t>Managed AI Pass — Routing &amp; Metering / routing &amp; metering of AI requests</w:t>
+              <w:t>Managed AI — Routing &amp; Metering / routing &amp; metering of AI requests</w:t>
             </w:r>
           </w:p>
         </w:tc>
@@ -413,12 +435,12 @@
     </w:p>
     <w:p>
       <w:r>
-        <w:t>This agreement sets out the data-protection obligations of the parties for the processing of personal data that Scandora performs as a processor on the managed "AI Pass" path on behalf of the controller. It supplements Scandora's Terms of Service and Privacy Policy.</w:t>
+        <w:t>This agreement sets out the data-protection obligations of the parties for the processing of personal data that Scandora performs as a processor on the managed AI path on behalf of the controller. It supplements Scandora's Terms of Service and Privacy Policy.</w:t>
       </w:r>
     </w:p>
     <w:p>
       <w:r>
-        <w:t>Note: this managed "AI Pass" path is not yet active. In BYOAI mode (your own API key) the customer is the controller and this DPA does not apply.</w:t>
+        <w:t>Note: this managed AI path is not yet active. In BYOAI mode (your own API key) the customer is the controller and this DPA does not apply.</w:t>
       </w:r>
     </w:p>
     <w:p>
@@ -431,7 +453,7 @@
     </w:p>
     <w:p>
       <w:r>
-        <w:t>The subject is the processing of document content for AI-assisted analysis via the managed AI Pass. Processing lasts for the duration of AI Pass use and ends when the underlying contract ends.</w:t>
+        <w:t>The subject is the processing of document content for AI-assisted analysis via the managed AI. Processing lasts for the duration of managed AI use and ends when the underlying contract ends.</w:t>
       </w:r>
     </w:p>
     <w:p>

</xml_diff>

<commit_message>
Deploy website - 2026-08-17 09:57:41
</commit_message>
<xml_diff>
--- a/assets/scandora-avv-dpa-template.docx
+++ b/assets/scandora-avv-dpa-template.docx
@@ -131,7 +131,7 @@
     </w:p>
     <w:p>
       <w:r>
-        <w:t>Hinweis: Dieser Managed-AI-Pfad ist noch nicht aktiv. Im BYOAI-Modus (eigener API-Schlüssel) ist der Kunde selbst Verantwortlicher; dieser AVV gilt dann nicht.</w:t>
+        <w:t>Hinweis: Der Managed-AI-Pfad ist aktiv und ist die Standardoption für neue Nutzer. Im BYOAI-Modus (eigener API-Schlüssel) ist der Kunde selbst Verantwortlicher; dieser AVV gilt dann nicht.</w:t>
       </w:r>
     </w:p>
     <w:p>
@@ -209,7 +209,7 @@
     </w:p>
     <w:p>
       <w:r>
-        <w:t>Der Verantwortliche genehmigt den Einsatz der unten gelisteten Unterauftragsverarbeiter. Diese Liste ist deckungsgleich mit Abschnitt 7 der Datenschutzerklärung von Scandora (https://scandora.eu/privacy.html). Scandora informiert über beabsichtigte Änderungen und räumt ein Widerspruchsrecht ein.</w:t>
+        <w:t>Der Verantwortliche genehmigt den Einsatz der unten gelisteten Unterauftragsverarbeiter. Da dieser AVV nur den Managed-AI-Pfad erfasst (Abschnitt 1), ist diese Liste eine Teilmenge von Abschnitt 7 der Datenschutzerklärung von Scandora (https://scandora.eu/privacy.html). Abschnitt 7 nennt zusätzlich die Anbieter, die Scandora als Verantwortlicher für eigene Zwecke einsetzt. Scandora informiert über beabsichtigte Änderungen und räumt ein Widerspruchsrecht ein.</w:t>
       </w:r>
     </w:p>
     <w:p>
@@ -354,38 +354,6 @@
           </w:tcPr>
           <w:p>
             <w:r>
-              <w:t>OpenAI</w:t>
-            </w:r>
-          </w:p>
-        </w:tc>
-        <w:tc>
-          <w:tcPr>
-            <w:tcW w:type="dxa" w:w="2880"/>
-          </w:tcPr>
-          <w:p>
-            <w:r>
-              <w:t>KI-Modellanbieter / AI model provider</w:t>
-            </w:r>
-          </w:p>
-        </w:tc>
-        <w:tc>
-          <w:tcPr>
-            <w:tcW w:type="dxa" w:w="2880"/>
-          </w:tcPr>
-          <w:p>
-            <w:r>
-              <w:t>USA</w:t>
-            </w:r>
-          </w:p>
-        </w:tc>
-      </w:tr>
-      <w:tr>
-        <w:tc>
-          <w:tcPr>
-            <w:tcW w:type="dxa" w:w="2880"/>
-          </w:tcPr>
-          <w:p>
-            <w:r>
               <w:t>Google (Gemini API)</w:t>
             </w:r>
           </w:p>
@@ -440,7 +408,7 @@
     </w:p>
     <w:p>
       <w:r>
-        <w:t>Note: this managed AI path is not yet active. In BYOAI mode (your own API key) the customer is the controller and this DPA does not apply.</w:t>
+        <w:t>Note: the managed AI path is active and is the default for new users. In BYOAI mode (your own API key) the customer is the controller and this DPA does not apply.</w:t>
       </w:r>
     </w:p>
     <w:p>
@@ -518,7 +486,7 @@
     </w:p>
     <w:p>
       <w:r>
-        <w:t>The controller authorises the sub-processors listed below. This list matches section 7 of Scandora's Privacy Policy (https://scandora.eu/privacy.html). Scandora informs of intended changes and grants a right to object.</w:t>
+        <w:t>The controller authorises the sub-processors listed below. Because this DPA covers the managed AI path only (section 1), this list is a subset of section 7 of Scandora's Privacy Policy (https://scandora.eu/privacy.html). Section 7 additionally names the providers Scandora uses as controller for its own purposes. Scandora informs of intended changes and grants a right to object.</w:t>
       </w:r>
     </w:p>
     <w:p>

</xml_diff>